<commit_message>
Gate only the paid AI route; collapse lead into a short blurb
- Replace whole-app Basic auth with an AI-route-only gate: AI_PASSWORD protects
  POST /api/generate; the editor, preview, and Word/HTML exports stay public.
  Browser prompts for the password once and stores it; 401s are cleared.
- Collapse the three lead paragraphs into a single {leadBlurb} intro: the build
  script drops stories 2 & 3 and tags paragraph 1; the detailed stories remain in
  the Updates/news section. Updated model, buildTags, preview, form, and prompt.
- Docs: .env.example + README updated (AI_PASSWORD, leadBlurb model).

Co-Authored-By: Claude Opus 4.8 (1M context) <noreply@anthropic.com>
</commit_message>
<xml_diff>
--- a/template/newsletter.docx
+++ b/template/newsletter.docx
@@ -42,60 +42,26 @@
           <w:color w:val="000000"/>
           <w:sz w:val="21"/>
         </w:rPr>
-        <w:t>In this month's Fortinet SE Newsletter, we lead with {leadHeadline}. {leadElaboration}. The takeaway for defenders: {leadTakeaway}.</w:t>
-      </w:r>
-    </w:p>
-    <w:p>
-      <w:pPr>
-        <w:rPr>
-          <w:rFonts w:ascii="Aptos" w:hAnsi="Aptos"/>
-          <w:color w:val="000000"/>
-          <w:sz w:val="21"/>
-        </w:rPr>
-      </w:pPr>
-    </w:p>
-    <w:p>
-      <w:pPr>
-        <w:rPr>
-          <w:rFonts w:ascii="Aptos" w:hAnsi="Aptos"/>
-          <w:color w:val="000000"/>
-          <w:sz w:val="21"/>
-        </w:rPr>
-      </w:pPr>
-      <w:r>
-        <w:rPr>
-          <w:rFonts w:ascii="Aptos" w:hAnsi="Aptos"/>
-          <w:color w:val="000000"/>
-          <w:sz w:val="21"/>
-        </w:rPr>
-        <w:t>We are also excited to share that {story2Headline}. {story2Summary}. {story2Quote}</w:t>
-      </w:r>
-    </w:p>
-    <w:p>
-      <w:pPr>
-        <w:rPr>
-          <w:rFonts w:ascii="Aptos" w:hAnsi="Aptos"/>
-          <w:color w:val="000000"/>
-          <w:sz w:val="21"/>
-        </w:rPr>
-      </w:pPr>
-    </w:p>
-    <w:p>
-      <w:pPr>
-        <w:rPr>
-          <w:rFonts w:ascii="Aptos" w:hAnsi="Aptos"/>
-          <w:color w:val="000000"/>
-          <w:sz w:val="21"/>
-        </w:rPr>
-      </w:pPr>
-      <w:r>
-        <w:rPr>
-          <w:rFonts w:ascii="Aptos" w:hAnsi="Aptos"/>
-          <w:color w:val="000000"/>
-          <w:sz w:val="21"/>
-        </w:rPr>
-        <w:t>We are also announcing {story3What} — {story3Models} — delivering {story3Benefits}.</w:t>
-      </w:r>
+        <w:t>{leadBlurb}</w:t>
+      </w:r>
+    </w:p>
+    <w:p>
+      <w:pPr>
+        <w:rPr>
+          <w:rFonts w:ascii="Aptos" w:hAnsi="Aptos"/>
+          <w:color w:val="000000"/>
+          <w:sz w:val="21"/>
+        </w:rPr>
+      </w:pPr>
+    </w:p>
+    <w:p>
+      <w:pPr>
+        <w:rPr>
+          <w:rFonts w:ascii="Aptos" w:hAnsi="Aptos"/>
+          <w:color w:val="000000"/>
+          <w:sz w:val="21"/>
+        </w:rPr>
+      </w:pPr>
     </w:p>
     <w:p>
       <w:pPr>

</xml_diff>